<commit_message>
Jal Rekha and District GIS  - new docs
Jal Rekha and District GIS  - new docs
</commit_message>
<xml_diff>
--- a/District_GIS_Parakh_CMMI_L5_Artifacts/District GIS Parakh Artefacts/indore inspection forms/BRD/Indore_Inspection_Requirement_Specification_V_2.0.docx
+++ b/District_GIS_Parakh_CMMI_L5_Artifacts/District GIS Parakh Artefacts/indore inspection forms/BRD/Indore_Inspection_Requirement_Specification_V_2.0.docx
@@ -1,6 +1,6 @@
 
 <file path=word/document.xml><?xml version="1.0" encoding="utf-8"?>
-<w:document xmlns:wpc="http://schemas.microsoft.com/office/word/2010/wordprocessingCanvas" xmlns:cx="http://schemas.microsoft.com/office/drawing/2014/chartex" xmlns:cx1="http://schemas.microsoft.com/office/drawing/2015/9/8/chartex" xmlns:cx2="http://schemas.microsoft.com/office/drawing/2015/10/21/chartex" xmlns:cx3="http://schemas.microsoft.com/office/drawing/2016/5/9/chartex" xmlns:cx4="http://schemas.microsoft.com/office/drawing/2016/5/10/chartex" xmlns:cx5="http://schemas.microsoft.com/office/drawing/2016/5/11/chartex" xmlns:cx6="http://schemas.microsoft.com/office/drawing/2016/5/12/chartex" xmlns:cx7="http://schemas.microsoft.com/office/drawing/2016/5/13/chartex" xmlns:cx8="http://schemas.microsoft.com/office/drawing/2016/5/14/chartex" xmlns:mc="http://schemas.openxmlformats.org/markup-compatibility/2006" xmlns:aink="http://schemas.microsoft.com/office/drawing/2016/ink" xmlns:am3d="http://schemas.microsoft.com/office/drawing/2017/model3d" xmlns:o="urn:schemas-microsoft-com:office:office" xmlns:oel="http://schemas.microsoft.com/office/2019/extlst" xmlns:r="http://schemas.openxmlformats.org/officeDocument/2006/relationships" xmlns:m="http://schemas.openxmlformats.org/officeDocument/2006/math" xmlns:v="urn:schemas-microsoft-com:vml" xmlns:wp14="http://schemas.microsoft.com/office/word/2010/wordprocessingDrawing" xmlns:wp="http://schemas.openxmlformats.org/drawingml/2006/wordprocessingDrawing" xmlns:w10="urn:schemas-microsoft-com:office:word" xmlns:w="http://schemas.openxmlformats.org/wordprocessingml/2006/main" xmlns:w14="http://schemas.microsoft.com/office/word/2010/wordml" xmlns:w15="http://schemas.microsoft.com/office/word/2012/wordml" xmlns:w16cei="http://schemas.microsoft.com/office/word/2026/wordml/cei" xmlns:w16cex="http://schemas.microsoft.com/office/word/2018/wordml/cex" xmlns:w16cid="http://schemas.microsoft.com/office/word/2016/wordml/cid" xmlns:w16="http://schemas.microsoft.com/office/word/2018/wordml" xmlns:w16du="http://schemas.microsoft.com/office/word/2023/wordml/word16du" xmlns:w16sdtdh="http://schemas.microsoft.com/office/word/2020/wordml/sdtdatahash" xmlns:w16sdtfl="http://schemas.microsoft.com/office/word/2024/wordml/sdtformatlock" xmlns:w16se="http://schemas.microsoft.com/office/word/2015/wordml/symex" xmlns:wpg="http://schemas.microsoft.com/office/word/2010/wordprocessingGroup" xmlns:wpi="http://schemas.microsoft.com/office/word/2010/wordprocessingInk" xmlns:wne="http://schemas.microsoft.com/office/word/2006/wordml" xmlns:wps="http://schemas.microsoft.com/office/word/2010/wordprocessingShape" mc:Ignorable="w14 w15 w16se w16cid w16 w16cex w16sdtdh w16sdtfl w16du wp14">
+<w:document xmlns:wpc="http://schemas.microsoft.com/office/word/2010/wordprocessingCanvas" xmlns:cx="http://schemas.microsoft.com/office/drawing/2014/chartex" xmlns:cx1="http://schemas.microsoft.com/office/drawing/2015/9/8/chartex" xmlns:cx2="http://schemas.microsoft.com/office/drawing/2015/10/21/chartex" xmlns:cx3="http://schemas.microsoft.com/office/drawing/2016/5/9/chartex" xmlns:cx4="http://schemas.microsoft.com/office/drawing/2016/5/10/chartex" xmlns:cx5="http://schemas.microsoft.com/office/drawing/2016/5/11/chartex" xmlns:cx6="http://schemas.microsoft.com/office/drawing/2016/5/12/chartex" xmlns:cx7="http://schemas.microsoft.com/office/drawing/2016/5/13/chartex" xmlns:cx8="http://schemas.microsoft.com/office/drawing/2016/5/14/chartex" xmlns:mc="http://schemas.openxmlformats.org/markup-compatibility/2006" xmlns:aink="http://schemas.microsoft.com/office/drawing/2016/ink" xmlns:am3d="http://schemas.microsoft.com/office/drawing/2017/model3d" xmlns:o="urn:schemas-microsoft-com:office:office" xmlns:oel="http://schemas.microsoft.com/office/2019/extlst" xmlns:r="http://schemas.openxmlformats.org/officeDocument/2006/relationships" xmlns:m="http://schemas.openxmlformats.org/officeDocument/2006/math" xmlns:v="urn:schemas-microsoft-com:vml" xmlns:wp14="http://schemas.microsoft.com/office/word/2010/wordprocessingDrawing" xmlns:wp="http://schemas.openxmlformats.org/drawingml/2006/wordprocessingDrawing" xmlns:w10="urn:schemas-microsoft-com:office:word" xmlns:w="http://schemas.openxmlformats.org/wordprocessingml/2006/main" xmlns:w14="http://schemas.microsoft.com/office/word/2010/wordml" xmlns:w15="http://schemas.microsoft.com/office/word/2012/wordml" xmlns:w16cex="http://schemas.microsoft.com/office/word/2018/wordml/cex" xmlns:w16cid="http://schemas.microsoft.com/office/word/2016/wordml/cid" xmlns:w16="http://schemas.microsoft.com/office/word/2018/wordml" xmlns:w16du="http://schemas.microsoft.com/office/word/2023/wordml/word16du" xmlns:w16sdtdh="http://schemas.microsoft.com/office/word/2020/wordml/sdtdatahash" xmlns:w16sdtfl="http://schemas.microsoft.com/office/word/2024/wordml/sdtformatlock" xmlns:w16se="http://schemas.microsoft.com/office/word/2015/wordml/symex" xmlns:wpg="http://schemas.microsoft.com/office/word/2010/wordprocessingGroup" xmlns:wpi="http://schemas.microsoft.com/office/word/2010/wordprocessingInk" xmlns:wne="http://schemas.microsoft.com/office/word/2006/wordml" xmlns:wps="http://schemas.microsoft.com/office/word/2010/wordprocessingShape" mc:Ignorable="w14 w15 w16se w16cid w16 w16cex w16sdtdh w16sdtfl w16du wp14">
   <w:body>
     <w:p>
       <w:pPr>
@@ -78,7 +78,31 @@
           <w:sz w:val="21"/>
           <w:szCs w:val="21"/>
         </w:rPr>
-        <w:t xml:space="preserve"> |  Web &amp; Mobile</w:t>
+        <w:t xml:space="preserve"> </w:t>
+      </w:r>
+      <w:proofErr w:type="gramStart"/>
+      <w:r>
+        <w:rPr>
+          <w:rFonts w:ascii="Calibri" w:hAnsi="Calibri" w:cs="Calibri"/>
+          <w:i/>
+          <w:iCs/>
+          <w:color w:val="595959"/>
+          <w:sz w:val="21"/>
+          <w:szCs w:val="21"/>
+        </w:rPr>
+        <w:t>|  Web</w:t>
+      </w:r>
+      <w:proofErr w:type="gramEnd"/>
+      <w:r>
+        <w:rPr>
+          <w:rFonts w:ascii="Calibri" w:hAnsi="Calibri" w:cs="Calibri"/>
+          <w:i/>
+          <w:iCs/>
+          <w:color w:val="595959"/>
+          <w:sz w:val="21"/>
+          <w:szCs w:val="21"/>
+        </w:rPr>
+        <w:t xml:space="preserve"> &amp; Mobile</w:t>
       </w:r>
     </w:p>
     <w:p>
@@ -1369,7 +1393,27 @@
           <w:sz w:val="21"/>
           <w:szCs w:val="21"/>
         </w:rPr>
-        <w:t>Inspector selects Department and Sub-Department from drop-downs (mandatory).</w:t>
+        <w:t xml:space="preserve">Inspector selects Department and Sub-Department from </w:t>
+      </w:r>
+      <w:proofErr w:type="gramStart"/>
+      <w:r>
+        <w:rPr>
+          <w:rFonts w:ascii="Calibri" w:hAnsi="Calibri" w:cs="Calibri"/>
+          <w:color w:val="262626"/>
+          <w:sz w:val="21"/>
+          <w:szCs w:val="21"/>
+        </w:rPr>
+        <w:t>drop-downs</w:t>
+      </w:r>
+      <w:proofErr w:type="gramEnd"/>
+      <w:r>
+        <w:rPr>
+          <w:rFonts w:ascii="Calibri" w:hAnsi="Calibri" w:cs="Calibri"/>
+          <w:color w:val="262626"/>
+          <w:sz w:val="21"/>
+          <w:szCs w:val="21"/>
+        </w:rPr>
+        <w:t xml:space="preserve"> (mandatory).</w:t>
       </w:r>
     </w:p>
     <w:p>
@@ -1453,7 +1497,47 @@
           <w:sz w:val="21"/>
           <w:szCs w:val="21"/>
         </w:rPr>
-        <w:t>On submission, the finding is auto-assigned to the concerned Department Officer/HOD for action, and simultaneously made visible (read-only) to the District Collector and Divisional Commissioner.</w:t>
+        <w:t xml:space="preserve">On submission, the finding is </w:t>
+      </w:r>
+      <w:proofErr w:type="gramStart"/>
+      <w:r>
+        <w:rPr>
+          <w:rFonts w:ascii="Calibri" w:hAnsi="Calibri" w:cs="Calibri"/>
+          <w:color w:val="262626"/>
+          <w:sz w:val="21"/>
+          <w:szCs w:val="21"/>
+        </w:rPr>
+        <w:t>auto-assigned</w:t>
+      </w:r>
+      <w:proofErr w:type="gramEnd"/>
+      <w:r>
+        <w:rPr>
+          <w:rFonts w:ascii="Calibri" w:hAnsi="Calibri" w:cs="Calibri"/>
+          <w:color w:val="262626"/>
+          <w:sz w:val="21"/>
+          <w:szCs w:val="21"/>
+        </w:rPr>
+        <w:t xml:space="preserve"> to the concerned Department Officer/HOD for </w:t>
+      </w:r>
+      <w:proofErr w:type="gramStart"/>
+      <w:r>
+        <w:rPr>
+          <w:rFonts w:ascii="Calibri" w:hAnsi="Calibri" w:cs="Calibri"/>
+          <w:color w:val="262626"/>
+          <w:sz w:val="21"/>
+          <w:szCs w:val="21"/>
+        </w:rPr>
+        <w:t>action, and</w:t>
+      </w:r>
+      <w:proofErr w:type="gramEnd"/>
+      <w:r>
+        <w:rPr>
+          <w:rFonts w:ascii="Calibri" w:hAnsi="Calibri" w:cs="Calibri"/>
+          <w:color w:val="262626"/>
+          <w:sz w:val="21"/>
+          <w:szCs w:val="21"/>
+        </w:rPr>
+        <w:t xml:space="preserve"> simultaneously made visible (read-only) to the District Collector and Divisional Commissioner.</w:t>
       </w:r>
     </w:p>
     <w:p>
@@ -1501,7 +1585,27 @@
           <w:sz w:val="21"/>
           <w:szCs w:val="21"/>
         </w:rPr>
-        <w:t>Every submitted inspection finding is auto-routed for action and tracked to closur</w:t>
+        <w:t xml:space="preserve">Every submitted inspection finding is </w:t>
+      </w:r>
+      <w:proofErr w:type="gramStart"/>
+      <w:r>
+        <w:rPr>
+          <w:rFonts w:ascii="Calibri" w:hAnsi="Calibri" w:cs="Calibri"/>
+          <w:color w:val="262626"/>
+          <w:sz w:val="21"/>
+          <w:szCs w:val="21"/>
+        </w:rPr>
+        <w:t>auto-routed</w:t>
+      </w:r>
+      <w:proofErr w:type="gramEnd"/>
+      <w:r>
+        <w:rPr>
+          <w:rFonts w:ascii="Calibri" w:hAnsi="Calibri" w:cs="Calibri"/>
+          <w:color w:val="262626"/>
+          <w:sz w:val="21"/>
+          <w:szCs w:val="21"/>
+        </w:rPr>
+        <w:t xml:space="preserve"> for action and tracked to closur</w:t>
       </w:r>
       <w:r>
         <w:rPr>
@@ -2142,7 +2246,25 @@
           <w:sz w:val="21"/>
           <w:szCs w:val="21"/>
         </w:rPr>
-        <w:t>Enable department-wise and officer-wise filtered reporting with the Pending/Completed status dashboard.</w:t>
+        <w:t>Enable department-wise and officer-</w:t>
+      </w:r>
+      <w:r>
+        <w:rPr>
+          <w:rFonts w:ascii="Calibri" w:hAnsi="Calibri" w:cs="Calibri"/>
+          <w:color w:val="262626"/>
+          <w:sz w:val="21"/>
+          <w:szCs w:val="21"/>
+        </w:rPr>
+        <w:t>wise, filtered</w:t>
+      </w:r>
+      <w:r>
+        <w:rPr>
+          <w:rFonts w:ascii="Calibri" w:hAnsi="Calibri" w:cs="Calibri"/>
+          <w:color w:val="262626"/>
+          <w:sz w:val="21"/>
+          <w:szCs w:val="21"/>
+        </w:rPr>
+        <w:t xml:space="preserve"> reporting with the Pending/Completed status dashboard.</w:t>
       </w:r>
     </w:p>
     <w:sectPr>
@@ -2156,7 +2278,7 @@
 </file>
 
 <file path=word/endnotes.xml><?xml version="1.0" encoding="utf-8"?>
-<w:endnotes xmlns:wpc="http://schemas.microsoft.com/office/word/2010/wordprocessingCanvas" xmlns:cx="http://schemas.microsoft.com/office/drawing/2014/chartex" xmlns:cx1="http://schemas.microsoft.com/office/drawing/2015/9/8/chartex" xmlns:cx2="http://schemas.microsoft.com/office/drawing/2015/10/21/chartex" xmlns:cx3="http://schemas.microsoft.com/office/drawing/2016/5/9/chartex" xmlns:cx4="http://schemas.microsoft.com/office/drawing/2016/5/10/chartex" xmlns:cx5="http://schemas.microsoft.com/office/drawing/2016/5/11/chartex" xmlns:cx6="http://schemas.microsoft.com/office/drawing/2016/5/12/chartex" xmlns:cx7="http://schemas.microsoft.com/office/drawing/2016/5/13/chartex" xmlns:cx8="http://schemas.microsoft.com/office/drawing/2016/5/14/chartex" xmlns:mc="http://schemas.openxmlformats.org/markup-compatibility/2006" xmlns:aink="http://schemas.microsoft.com/office/drawing/2016/ink" xmlns:am3d="http://schemas.microsoft.com/office/drawing/2017/model3d" xmlns:o="urn:schemas-microsoft-com:office:office" xmlns:oel="http://schemas.microsoft.com/office/2019/extlst" xmlns:r="http://schemas.openxmlformats.org/officeDocument/2006/relationships" xmlns:m="http://schemas.openxmlformats.org/officeDocument/2006/math" xmlns:v="urn:schemas-microsoft-com:vml" xmlns:wp14="http://schemas.microsoft.com/office/word/2010/wordprocessingDrawing" xmlns:wp="http://schemas.openxmlformats.org/drawingml/2006/wordprocessingDrawing" xmlns:w10="urn:schemas-microsoft-com:office:word" xmlns:w="http://schemas.openxmlformats.org/wordprocessingml/2006/main" xmlns:w14="http://schemas.microsoft.com/office/word/2010/wordml" xmlns:w15="http://schemas.microsoft.com/office/word/2012/wordml" xmlns:w16cei="http://schemas.microsoft.com/office/word/2026/wordml/cei" xmlns:w16cex="http://schemas.microsoft.com/office/word/2018/wordml/cex" xmlns:w16cid="http://schemas.microsoft.com/office/word/2016/wordml/cid" xmlns:w16="http://schemas.microsoft.com/office/word/2018/wordml" xmlns:w16du="http://schemas.microsoft.com/office/word/2023/wordml/word16du" xmlns:w16sdtdh="http://schemas.microsoft.com/office/word/2020/wordml/sdtdatahash" xmlns:w16sdtfl="http://schemas.microsoft.com/office/word/2024/wordml/sdtformatlock" xmlns:w16se="http://schemas.microsoft.com/office/word/2015/wordml/symex" xmlns:wpg="http://schemas.microsoft.com/office/word/2010/wordprocessingGroup" xmlns:wpi="http://schemas.microsoft.com/office/word/2010/wordprocessingInk" xmlns:wne="http://schemas.microsoft.com/office/word/2006/wordml" xmlns:wps="http://schemas.microsoft.com/office/word/2010/wordprocessingShape" mc:Ignorable="w14 w15 w16se w16cid w16 w16cex w16sdtdh w16sdtfl w16du wp14">
+<w:endnotes xmlns:wpc="http://schemas.microsoft.com/office/word/2010/wordprocessingCanvas" xmlns:cx="http://schemas.microsoft.com/office/drawing/2014/chartex" xmlns:cx1="http://schemas.microsoft.com/office/drawing/2015/9/8/chartex" xmlns:cx2="http://schemas.microsoft.com/office/drawing/2015/10/21/chartex" xmlns:cx3="http://schemas.microsoft.com/office/drawing/2016/5/9/chartex" xmlns:cx4="http://schemas.microsoft.com/office/drawing/2016/5/10/chartex" xmlns:cx5="http://schemas.microsoft.com/office/drawing/2016/5/11/chartex" xmlns:cx6="http://schemas.microsoft.com/office/drawing/2016/5/12/chartex" xmlns:cx7="http://schemas.microsoft.com/office/drawing/2016/5/13/chartex" xmlns:cx8="http://schemas.microsoft.com/office/drawing/2016/5/14/chartex" xmlns:mc="http://schemas.openxmlformats.org/markup-compatibility/2006" xmlns:aink="http://schemas.microsoft.com/office/drawing/2016/ink" xmlns:am3d="http://schemas.microsoft.com/office/drawing/2017/model3d" xmlns:o="urn:schemas-microsoft-com:office:office" xmlns:oel="http://schemas.microsoft.com/office/2019/extlst" xmlns:r="http://schemas.openxmlformats.org/officeDocument/2006/relationships" xmlns:m="http://schemas.openxmlformats.org/officeDocument/2006/math" xmlns:v="urn:schemas-microsoft-com:vml" xmlns:wp14="http://schemas.microsoft.com/office/word/2010/wordprocessingDrawing" xmlns:wp="http://schemas.openxmlformats.org/drawingml/2006/wordprocessingDrawing" xmlns:w10="urn:schemas-microsoft-com:office:word" xmlns:w="http://schemas.openxmlformats.org/wordprocessingml/2006/main" xmlns:w14="http://schemas.microsoft.com/office/word/2010/wordml" xmlns:w15="http://schemas.microsoft.com/office/word/2012/wordml" xmlns:w16cex="http://schemas.microsoft.com/office/word/2018/wordml/cex" xmlns:w16cid="http://schemas.microsoft.com/office/word/2016/wordml/cid" xmlns:w16="http://schemas.microsoft.com/office/word/2018/wordml" xmlns:w16du="http://schemas.microsoft.com/office/word/2023/wordml/word16du" xmlns:w16sdtdh="http://schemas.microsoft.com/office/word/2020/wordml/sdtdatahash" xmlns:w16sdtfl="http://schemas.microsoft.com/office/word/2024/wordml/sdtformatlock" xmlns:w16se="http://schemas.microsoft.com/office/word/2015/wordml/symex" xmlns:wpg="http://schemas.microsoft.com/office/word/2010/wordprocessingGroup" xmlns:wpi="http://schemas.microsoft.com/office/word/2010/wordprocessingInk" xmlns:wne="http://schemas.microsoft.com/office/word/2006/wordml" xmlns:wps="http://schemas.microsoft.com/office/word/2010/wordprocessingShape" mc:Ignorable="w14 w15 w16se w16cid w16 w16cex w16sdtdh w16sdtfl w16du wp14">
   <w:endnote w:type="separator" w:id="-1">
     <w:p>
       <w:r>
@@ -2175,7 +2297,7 @@
 </file>
 
 <file path=word/footnotes.xml><?xml version="1.0" encoding="utf-8"?>
-<w:footnotes xmlns:wpc="http://schemas.microsoft.com/office/word/2010/wordprocessingCanvas" xmlns:cx="http://schemas.microsoft.com/office/drawing/2014/chartex" xmlns:cx1="http://schemas.microsoft.com/office/drawing/2015/9/8/chartex" xmlns:cx2="http://schemas.microsoft.com/office/drawing/2015/10/21/chartex" xmlns:cx3="http://schemas.microsoft.com/office/drawing/2016/5/9/chartex" xmlns:cx4="http://schemas.microsoft.com/office/drawing/2016/5/10/chartex" xmlns:cx5="http://schemas.microsoft.com/office/drawing/2016/5/11/chartex" xmlns:cx6="http://schemas.microsoft.com/office/drawing/2016/5/12/chartex" xmlns:cx7="http://schemas.microsoft.com/office/drawing/2016/5/13/chartex" xmlns:cx8="http://schemas.microsoft.com/office/drawing/2016/5/14/chartex" xmlns:mc="http://schemas.openxmlformats.org/markup-compatibility/2006" xmlns:aink="http://schemas.microsoft.com/office/drawing/2016/ink" xmlns:am3d="http://schemas.microsoft.com/office/drawing/2017/model3d" xmlns:o="urn:schemas-microsoft-com:office:office" xmlns:oel="http://schemas.microsoft.com/office/2019/extlst" xmlns:r="http://schemas.openxmlformats.org/officeDocument/2006/relationships" xmlns:m="http://schemas.openxmlformats.org/officeDocument/2006/math" xmlns:v="urn:schemas-microsoft-com:vml" xmlns:wp14="http://schemas.microsoft.com/office/word/2010/wordprocessingDrawing" xmlns:wp="http://schemas.openxmlformats.org/drawingml/2006/wordprocessingDrawing" xmlns:w10="urn:schemas-microsoft-com:office:word" xmlns:w="http://schemas.openxmlformats.org/wordprocessingml/2006/main" xmlns:w14="http://schemas.microsoft.com/office/word/2010/wordml" xmlns:w15="http://schemas.microsoft.com/office/word/2012/wordml" xmlns:w16cei="http://schemas.microsoft.com/office/word/2026/wordml/cei" xmlns:w16cex="http://schemas.microsoft.com/office/word/2018/wordml/cex" xmlns:w16cid="http://schemas.microsoft.com/office/word/2016/wordml/cid" xmlns:w16="http://schemas.microsoft.com/office/word/2018/wordml" xmlns:w16du="http://schemas.microsoft.com/office/word/2023/wordml/word16du" xmlns:w16sdtdh="http://schemas.microsoft.com/office/word/2020/wordml/sdtdatahash" xmlns:w16sdtfl="http://schemas.microsoft.com/office/word/2024/wordml/sdtformatlock" xmlns:w16se="http://schemas.microsoft.com/office/word/2015/wordml/symex" xmlns:wpg="http://schemas.microsoft.com/office/word/2010/wordprocessingGroup" xmlns:wpi="http://schemas.microsoft.com/office/word/2010/wordprocessingInk" xmlns:wne="http://schemas.microsoft.com/office/word/2006/wordml" xmlns:wps="http://schemas.microsoft.com/office/word/2010/wordprocessingShape" mc:Ignorable="w14 w15 w16se w16cid w16 w16cex w16sdtdh w16sdtfl w16du wp14">
+<w:footnotes xmlns:wpc="http://schemas.microsoft.com/office/word/2010/wordprocessingCanvas" xmlns:cx="http://schemas.microsoft.com/office/drawing/2014/chartex" xmlns:cx1="http://schemas.microsoft.com/office/drawing/2015/9/8/chartex" xmlns:cx2="http://schemas.microsoft.com/office/drawing/2015/10/21/chartex" xmlns:cx3="http://schemas.microsoft.com/office/drawing/2016/5/9/chartex" xmlns:cx4="http://schemas.microsoft.com/office/drawing/2016/5/10/chartex" xmlns:cx5="http://schemas.microsoft.com/office/drawing/2016/5/11/chartex" xmlns:cx6="http://schemas.microsoft.com/office/drawing/2016/5/12/chartex" xmlns:cx7="http://schemas.microsoft.com/office/drawing/2016/5/13/chartex" xmlns:cx8="http://schemas.microsoft.com/office/drawing/2016/5/14/chartex" xmlns:mc="http://schemas.openxmlformats.org/markup-compatibility/2006" xmlns:aink="http://schemas.microsoft.com/office/drawing/2016/ink" xmlns:am3d="http://schemas.microsoft.com/office/drawing/2017/model3d" xmlns:o="urn:schemas-microsoft-com:office:office" xmlns:oel="http://schemas.microsoft.com/office/2019/extlst" xmlns:r="http://schemas.openxmlformats.org/officeDocument/2006/relationships" xmlns:m="http://schemas.openxmlformats.org/officeDocument/2006/math" xmlns:v="urn:schemas-microsoft-com:vml" xmlns:wp14="http://schemas.microsoft.com/office/word/2010/wordprocessingDrawing" xmlns:wp="http://schemas.openxmlformats.org/drawingml/2006/wordprocessingDrawing" xmlns:w10="urn:schemas-microsoft-com:office:word" xmlns:w="http://schemas.openxmlformats.org/wordprocessingml/2006/main" xmlns:w14="http://schemas.microsoft.com/office/word/2010/wordml" xmlns:w15="http://schemas.microsoft.com/office/word/2012/wordml" xmlns:w16cex="http://schemas.microsoft.com/office/word/2018/wordml/cex" xmlns:w16cid="http://schemas.microsoft.com/office/word/2016/wordml/cid" xmlns:w16="http://schemas.microsoft.com/office/word/2018/wordml" xmlns:w16du="http://schemas.microsoft.com/office/word/2023/wordml/word16du" xmlns:w16sdtdh="http://schemas.microsoft.com/office/word/2020/wordml/sdtdatahash" xmlns:w16sdtfl="http://schemas.microsoft.com/office/word/2024/wordml/sdtformatlock" xmlns:w16se="http://schemas.microsoft.com/office/word/2015/wordml/symex" xmlns:wpg="http://schemas.microsoft.com/office/word/2010/wordprocessingGroup" xmlns:wpi="http://schemas.microsoft.com/office/word/2010/wordprocessingInk" xmlns:wne="http://schemas.microsoft.com/office/word/2006/wordml" xmlns:wps="http://schemas.microsoft.com/office/word/2010/wordprocessingShape" mc:Ignorable="w14 w15 w16se w16cid w16 w16cex w16sdtdh w16sdtfl w16du wp14">
   <w:footnote w:type="separator" w:id="-1">
     <w:p>
       <w:r>
@@ -2194,7 +2316,7 @@
 </file>
 
 <file path=word/numbering.xml><?xml version="1.0" encoding="utf-8"?>
-<w:numbering xmlns:wpc="http://schemas.microsoft.com/office/word/2010/wordprocessingCanvas" xmlns:cx="http://schemas.microsoft.com/office/drawing/2014/chartex" xmlns:cx1="http://schemas.microsoft.com/office/drawing/2015/9/8/chartex" xmlns:cx2="http://schemas.microsoft.com/office/drawing/2015/10/21/chartex" xmlns:cx3="http://schemas.microsoft.com/office/drawing/2016/5/9/chartex" xmlns:cx4="http://schemas.microsoft.com/office/drawing/2016/5/10/chartex" xmlns:cx5="http://schemas.microsoft.com/office/drawing/2016/5/11/chartex" xmlns:cx6="http://schemas.microsoft.com/office/drawing/2016/5/12/chartex" xmlns:cx7="http://schemas.microsoft.com/office/drawing/2016/5/13/chartex" xmlns:cx8="http://schemas.microsoft.com/office/drawing/2016/5/14/chartex" xmlns:mc="http://schemas.openxmlformats.org/markup-compatibility/2006" xmlns:aink="http://schemas.microsoft.com/office/drawing/2016/ink" xmlns:am3d="http://schemas.microsoft.com/office/drawing/2017/model3d" xmlns:o="urn:schemas-microsoft-com:office:office" xmlns:oel="http://schemas.microsoft.com/office/2019/extlst" xmlns:r="http://schemas.openxmlformats.org/officeDocument/2006/relationships" xmlns:m="http://schemas.openxmlformats.org/officeDocument/2006/math" xmlns:v="urn:schemas-microsoft-com:vml" xmlns:wp14="http://schemas.microsoft.com/office/word/2010/wordprocessingDrawing" xmlns:wp="http://schemas.openxmlformats.org/drawingml/2006/wordprocessingDrawing" xmlns:w10="urn:schemas-microsoft-com:office:word" xmlns:w="http://schemas.openxmlformats.org/wordprocessingml/2006/main" xmlns:w14="http://schemas.microsoft.com/office/word/2010/wordml" xmlns:w15="http://schemas.microsoft.com/office/word/2012/wordml" xmlns:w16cei="http://schemas.microsoft.com/office/word/2026/wordml/cei" xmlns:w16cex="http://schemas.microsoft.com/office/word/2018/wordml/cex" xmlns:w16cid="http://schemas.microsoft.com/office/word/2016/wordml/cid" xmlns:w16="http://schemas.microsoft.com/office/word/2018/wordml" xmlns:w16du="http://schemas.microsoft.com/office/word/2023/wordml/word16du" xmlns:w16sdtdh="http://schemas.microsoft.com/office/word/2020/wordml/sdtdatahash" xmlns:w16sdtfl="http://schemas.microsoft.com/office/word/2024/wordml/sdtformatlock" xmlns:w16se="http://schemas.microsoft.com/office/word/2015/wordml/symex" xmlns:wpg="http://schemas.microsoft.com/office/word/2010/wordprocessingGroup" xmlns:wpi="http://schemas.microsoft.com/office/word/2010/wordprocessingInk" xmlns:wne="http://schemas.microsoft.com/office/word/2006/wordml" xmlns:wps="http://schemas.microsoft.com/office/word/2010/wordprocessingShape" mc:Ignorable="w14 w15 w16se w16cid w16 w16cex w16sdtdh w16sdtfl w16du wp14">
+<w:numbering xmlns:wpc="http://schemas.microsoft.com/office/word/2010/wordprocessingCanvas" xmlns:cx="http://schemas.microsoft.com/office/drawing/2014/chartex" xmlns:cx1="http://schemas.microsoft.com/office/drawing/2015/9/8/chartex" xmlns:cx2="http://schemas.microsoft.com/office/drawing/2015/10/21/chartex" xmlns:cx3="http://schemas.microsoft.com/office/drawing/2016/5/9/chartex" xmlns:cx4="http://schemas.microsoft.com/office/drawing/2016/5/10/chartex" xmlns:cx5="http://schemas.microsoft.com/office/drawing/2016/5/11/chartex" xmlns:cx6="http://schemas.microsoft.com/office/drawing/2016/5/12/chartex" xmlns:cx7="http://schemas.microsoft.com/office/drawing/2016/5/13/chartex" xmlns:cx8="http://schemas.microsoft.com/office/drawing/2016/5/14/chartex" xmlns:mc="http://schemas.openxmlformats.org/markup-compatibility/2006" xmlns:aink="http://schemas.microsoft.com/office/drawing/2016/ink" xmlns:am3d="http://schemas.microsoft.com/office/drawing/2017/model3d" xmlns:o="urn:schemas-microsoft-com:office:office" xmlns:oel="http://schemas.microsoft.com/office/2019/extlst" xmlns:r="http://schemas.openxmlformats.org/officeDocument/2006/relationships" xmlns:m="http://schemas.openxmlformats.org/officeDocument/2006/math" xmlns:v="urn:schemas-microsoft-com:vml" xmlns:wp14="http://schemas.microsoft.com/office/word/2010/wordprocessingDrawing" xmlns:wp="http://schemas.openxmlformats.org/drawingml/2006/wordprocessingDrawing" xmlns:w10="urn:schemas-microsoft-com:office:word" xmlns:w="http://schemas.openxmlformats.org/wordprocessingml/2006/main" xmlns:w14="http://schemas.microsoft.com/office/word/2010/wordml" xmlns:w15="http://schemas.microsoft.com/office/word/2012/wordml" xmlns:w16cex="http://schemas.microsoft.com/office/word/2018/wordml/cex" xmlns:w16cid="http://schemas.microsoft.com/office/word/2016/wordml/cid" xmlns:w16="http://schemas.microsoft.com/office/word/2018/wordml" xmlns:w16du="http://schemas.microsoft.com/office/word/2023/wordml/word16du" xmlns:w16sdtdh="http://schemas.microsoft.com/office/word/2020/wordml/sdtdatahash" xmlns:w16sdtfl="http://schemas.microsoft.com/office/word/2024/wordml/sdtformatlock" xmlns:w16se="http://schemas.microsoft.com/office/word/2015/wordml/symex" xmlns:wpg="http://schemas.microsoft.com/office/word/2010/wordprocessingGroup" xmlns:wpi="http://schemas.microsoft.com/office/word/2010/wordprocessingInk" xmlns:wne="http://schemas.microsoft.com/office/word/2006/wordml" xmlns:wps="http://schemas.microsoft.com/office/word/2010/wordprocessingShape" mc:Ignorable="w14 w15 w16se w16cid w16 w16cex w16sdtdh w16sdtfl w16du wp14">
   <w:abstractNum w:abstractNumId="0" w15:restartNumberingAfterBreak="0">
     <w:nsid w:val="0FEC7B17"/>
     <w:multiLevelType w:val="hybridMultilevel"/>

</xml_diff>